<commit_message>
docs: add Fixed Assets & Revaluation to user guide + UAT tracker
- Word: new section 13 (Fixed Assets, Depreciation & Revaluation) with
  feature list, user guide and AS-01..AS-06 test scenarios; module count
  updated to 12; End-to-End renumbered to 14.
- UAT tracker: +6 cases (AS-01..AS-06), total 49; Summary auto-includes
  the Fixed Assets module.

Co-Authored-By: Claude Opus 4.8 <noreply@anthropic.com>
Claude-Session: https://claude.ai/code/session_016VgZWku95cicE6VZPkFTLL
</commit_message>
<xml_diff>
--- a/docs/Custom_Modules_Feature_List_UserGuide_TestScenarios.docx
+++ b/docs/Custom_Modules_Feature_List_UserGuide_TestScenarios.docx
@@ -102,7 +102,7 @@
                 <w:b w:val="0"/>
                 <w:sz w:val="20"/>
               </w:rPr>
-              <w:t>11 modul companion + integrasi modul standar Odoo 19</w:t>
+              <w:t>12 modul companion + integrasi modul standar Odoo 19</w:t>
             </w:r>
           </w:p>
         </w:tc>
@@ -814,6 +814,53 @@
                 <w:sz w:val="17"/>
               </w:rPr>
               <w:t>documents</w:t>
+            </w:r>
+          </w:p>
+        </w:tc>
+      </w:tr>
+      <w:tr>
+        <w:tc>
+          <w:tcPr>
+            <w:tcW w:type="dxa" w:w="3312"/>
+          </w:tcPr>
+          <w:p>
+            <w:r/>
+            <w:r>
+              <w:rPr>
+                <w:b/>
+                <w:sz w:val="17"/>
+              </w:rPr>
+              <w:t>rental_management_asset</w:t>
+            </w:r>
+          </w:p>
+        </w:tc>
+        <w:tc>
+          <w:tcPr>
+            <w:tcW w:type="dxa" w:w="4320"/>
+          </w:tcPr>
+          <w:p>
+            <w:r/>
+            <w:r>
+              <w:rPr>
+                <w:b w:val="0"/>
+                <w:sz w:val="17"/>
+              </w:rPr>
+              <w:t>Fixed Asset: penyusutan (linear/declining) + revaluation + sync CORETAX L9</w:t>
+            </w:r>
+          </w:p>
+        </w:tc>
+        <w:tc>
+          <w:tcPr>
+            <w:tcW w:type="dxa" w:w="2016"/>
+          </w:tcPr>
+          <w:p>
+            <w:r/>
+            <w:r>
+              <w:rPr>
+                <w:b w:val="0"/>
+                <w:sz w:val="17"/>
+              </w:rPr>
+              <w:t>account</w:t>
             </w:r>
           </w:p>
         </w:tc>
@@ -7285,7 +7332,774 @@
           <w:color w:val="1F3964"/>
           <w:sz w:val="30"/>
         </w:rPr>
-        <w:t>13. Skenario Test End-to-End (Alur Lengkap)</w:t>
+        <w:t>13. Modul: Fixed Assets, Depreciation &amp; Revaluation</w:t>
+      </w:r>
+    </w:p>
+    <w:p>
+      <w:pPr>
+        <w:spacing w:after="120"/>
+      </w:pPr>
+      <w:r>
+        <w:rPr>
+          <w:b w:val="0"/>
+          <w:i/>
+          <w:color w:val="555555"/>
+          <w:sz w:val="21"/>
+        </w:rPr>
+        <w:t>Nama teknis: rental_management_asset — Menu: Properties → Fixed Assets.</w:t>
+      </w:r>
+    </w:p>
+    <w:p>
+      <w:pPr>
+        <w:pStyle w:val="Heading2"/>
+      </w:pPr>
+      <w:r>
+        <w:rPr>
+          <w:color w:val="006A4E"/>
+          <w:sz w:val="25"/>
+        </w:rPr>
+        <w:t>13.1 Daftar Fitur</w:t>
+      </w:r>
+    </w:p>
+    <w:tbl>
+      <w:tblPr>
+        <w:tblStyle w:val="TableGrid"/>
+        <w:tblW w:type="auto" w:w="0"/>
+        <w:tblLook w:firstColumn="1" w:firstRow="1" w:lastColumn="0" w:lastRow="0" w:noHBand="0" w:noVBand="1" w:val="04A0"/>
+      </w:tblPr>
+      <w:tblGrid>
+        <w:gridCol w:w="4320"/>
+        <w:gridCol w:w="4320"/>
+      </w:tblGrid>
+      <w:tr>
+        <w:tc>
+          <w:tcPr>
+            <w:tcW w:type="dxa" w:w="4320"/>
+            <w:shd w:val="clear" w:color="auto" w:fill="006A4E"/>
+          </w:tcPr>
+          <w:p>
+            <w:r/>
+            <w:r>
+              <w:rPr>
+                <w:b/>
+                <w:color w:val="FFFFFF"/>
+                <w:sz w:val="18"/>
+              </w:rPr>
+              <w:t>Fitur</w:t>
+            </w:r>
+          </w:p>
+        </w:tc>
+        <w:tc>
+          <w:tcPr>
+            <w:tcW w:type="dxa" w:w="4320"/>
+            <w:shd w:val="clear" w:color="auto" w:fill="006A4E"/>
+          </w:tcPr>
+          <w:p>
+            <w:r/>
+            <w:r>
+              <w:rPr>
+                <w:b/>
+                <w:color w:val="FFFFFF"/>
+                <w:sz w:val="18"/>
+              </w:rPr>
+              <w:t>Deskripsi</w:t>
+            </w:r>
+          </w:p>
+        </w:tc>
+      </w:tr>
+      <w:tr>
+        <w:tc>
+          <w:tcPr>
+            <w:tcW w:type="dxa" w:w="3024"/>
+          </w:tcPr>
+          <w:p>
+            <w:r/>
+            <w:r>
+              <w:rPr>
+                <w:b/>
+                <w:sz w:val="18"/>
+              </w:rPr>
+              <w:t>Asset Register</w:t>
+            </w:r>
+          </w:p>
+        </w:tc>
+        <w:tc>
+          <w:tcPr>
+            <w:tcW w:type="dxa" w:w="6624"/>
+          </w:tcPr>
+          <w:p>
+            <w:r/>
+            <w:r>
+              <w:rPr>
+                <w:b w:val="0"/>
+                <w:sz w:val="18"/>
+              </w:rPr>
+              <w:t>Aset terhubung properti: nilai perolehan, salvage, metode, jumlah &amp; periode penyusutan, akun &amp; jurnal.</w:t>
+            </w:r>
+          </w:p>
+        </w:tc>
+      </w:tr>
+      <w:tr>
+        <w:tc>
+          <w:tcPr>
+            <w:tcW w:type="dxa" w:w="3024"/>
+          </w:tcPr>
+          <w:p>
+            <w:r/>
+            <w:r>
+              <w:rPr>
+                <w:b/>
+                <w:sz w:val="18"/>
+              </w:rPr>
+              <w:t>Depreciation Board</w:t>
+            </w:r>
+          </w:p>
+        </w:tc>
+        <w:tc>
+          <w:tcPr>
+            <w:tcW w:type="dxa" w:w="6624"/>
+          </w:tcPr>
+          <w:p>
+            <w:r/>
+            <w:r>
+              <w:rPr>
+                <w:b w:val="0"/>
+                <w:sz w:val="18"/>
+              </w:rPr>
+              <w:t>Jadwal penyusutan Garis Lurus / Saldo Menurun; posting jurnal Dr Beban / Cr Akumulasi, ber-tag properti.</w:t>
+            </w:r>
+          </w:p>
+        </w:tc>
+      </w:tr>
+      <w:tr>
+        <w:tc>
+          <w:tcPr>
+            <w:tcW w:type="dxa" w:w="3024"/>
+          </w:tcPr>
+          <w:p>
+            <w:r/>
+            <w:r>
+              <w:rPr>
+                <w:b/>
+                <w:sz w:val="18"/>
+              </w:rPr>
+              <w:t>Auto-post (Cron)</w:t>
+            </w:r>
+          </w:p>
+        </w:tc>
+        <w:tc>
+          <w:tcPr>
+            <w:tcW w:type="dxa" w:w="6624"/>
+          </w:tcPr>
+          <w:p>
+            <w:r/>
+            <w:r>
+              <w:rPr>
+                <w:b w:val="0"/>
+                <w:sz w:val="18"/>
+              </w:rPr>
+              <w:t>Cron harian memposting baris penyusutan yang jatuh tempo.</w:t>
+            </w:r>
+          </w:p>
+        </w:tc>
+      </w:tr>
+      <w:tr>
+        <w:tc>
+          <w:tcPr>
+            <w:tcW w:type="dxa" w:w="3024"/>
+          </w:tcPr>
+          <w:p>
+            <w:r/>
+            <w:r>
+              <w:rPr>
+                <w:b/>
+                <w:sz w:val="18"/>
+              </w:rPr>
+              <w:t>Revaluation</w:t>
+            </w:r>
+          </w:p>
+        </w:tc>
+        <w:tc>
+          <w:tcPr>
+            <w:tcW w:type="dxa" w:w="6624"/>
+          </w:tcPr>
+          <w:p>
+            <w:r/>
+            <w:r>
+              <w:rPr>
+                <w:b w:val="0"/>
+                <w:sz w:val="18"/>
+              </w:rPr>
+              <w:t>Revaluasi naik/turun: posting ke Revaluation Reserve + recompute prospektif sisa board.</w:t>
+            </w:r>
+          </w:p>
+        </w:tc>
+      </w:tr>
+      <w:tr>
+        <w:tc>
+          <w:tcPr>
+            <w:tcW w:type="dxa" w:w="3024"/>
+          </w:tcPr>
+          <w:p>
+            <w:r/>
+            <w:r>
+              <w:rPr>
+                <w:b/>
+                <w:sz w:val="18"/>
+              </w:rPr>
+              <w:t>Sync CORETAX L9</w:t>
+            </w:r>
+          </w:p>
+        </w:tc>
+        <w:tc>
+          <w:tcPr>
+            <w:tcW w:type="dxa" w:w="6624"/>
+          </w:tcPr>
+          <w:p>
+            <w:r/>
+            <w:r>
+              <w:rPr>
+                <w:b w:val="0"/>
+                <w:sz w:val="18"/>
+              </w:rPr>
+              <w:t>Buat entri register penyusutan CORETAX L9 dari aset (bila modul coretax terpasang).</w:t>
+            </w:r>
+          </w:p>
+        </w:tc>
+      </w:tr>
+    </w:tbl>
+    <w:p/>
+    <w:p>
+      <w:pPr>
+        <w:pStyle w:val="Heading2"/>
+      </w:pPr>
+      <w:r>
+        <w:rPr>
+          <w:color w:val="006A4E"/>
+          <w:sz w:val="25"/>
+        </w:rPr>
+        <w:t>13.2 User Guide</w:t>
+      </w:r>
+    </w:p>
+    <w:p>
+      <w:pPr>
+        <w:pStyle w:val="ListNumber"/>
+      </w:pPr>
+      <w:r>
+        <w:t>Properties → Fixed Assets → New: isi properti, tanggal &amp; nilai perolehan, salvage, metode, jumlah/periode, akun &amp; jurnal.</w:t>
+      </w:r>
+    </w:p>
+    <w:p>
+      <w:pPr>
+        <w:pStyle w:val="ListNumber"/>
+      </w:pPr>
+      <w:r>
+        <w:t>Klik Compute Depreciation → tinjau board → Confirm (state Running).</w:t>
+      </w:r>
+    </w:p>
+    <w:p>
+      <w:pPr>
+        <w:pStyle w:val="ListNumber"/>
+      </w:pPr>
+      <w:r>
+        <w:t>Klik Post Due Depreciation (atau biarkan cron harian).</w:t>
+      </w:r>
+    </w:p>
+    <w:p>
+      <w:pPr>
+        <w:pStyle w:val="ListNumber"/>
+      </w:pPr>
+      <w:r>
+        <w:t>Untuk revaluasi: tambah baris Revaluation (+/-) → Post Revaluations (board sisa dihitung ulang atas nilai buku baru).</w:t>
+      </w:r>
+    </w:p>
+    <w:p>
+      <w:pPr>
+        <w:pStyle w:val="ListNumber"/>
+      </w:pPr>
+      <w:r>
+        <w:t>Klik Sync CORETAX L9 untuk mendorong aset ke register penyusutan tahunan.</w:t>
+      </w:r>
+    </w:p>
+    <w:p>
+      <w:pPr>
+        <w:pStyle w:val="Heading2"/>
+      </w:pPr>
+      <w:r>
+        <w:rPr>
+          <w:color w:val="006A4E"/>
+          <w:sz w:val="25"/>
+        </w:rPr>
+        <w:t>13.3 Skenario Test</w:t>
+      </w:r>
+    </w:p>
+    <w:tbl>
+      <w:tblPr>
+        <w:tblStyle w:val="TableGrid"/>
+        <w:tblW w:type="auto" w:w="0"/>
+        <w:jc w:val="center"/>
+        <w:tblLook w:firstColumn="1" w:firstRow="1" w:lastColumn="0" w:lastRow="0" w:noHBand="0" w:noVBand="1" w:val="04A0"/>
+      </w:tblPr>
+      <w:tblGrid>
+        <w:gridCol w:w="2160"/>
+        <w:gridCol w:w="2160"/>
+        <w:gridCol w:w="2160"/>
+        <w:gridCol w:w="2160"/>
+      </w:tblGrid>
+      <w:tr>
+        <w:tc>
+          <w:tcPr>
+            <w:tcW w:type="dxa" w:w="2160"/>
+            <w:shd w:val="clear" w:color="auto" w:fill="1F3964"/>
+          </w:tcPr>
+          <w:p>
+            <w:r/>
+            <w:r>
+              <w:rPr>
+                <w:b/>
+                <w:color w:val="FFFFFF"/>
+                <w:sz w:val="18"/>
+              </w:rPr>
+              <w:t>ID</w:t>
+            </w:r>
+          </w:p>
+        </w:tc>
+        <w:tc>
+          <w:tcPr>
+            <w:tcW w:type="dxa" w:w="2160"/>
+            <w:shd w:val="clear" w:color="auto" w:fill="1F3964"/>
+          </w:tcPr>
+          <w:p>
+            <w:r/>
+            <w:r>
+              <w:rPr>
+                <w:b/>
+                <w:color w:val="FFFFFF"/>
+                <w:sz w:val="18"/>
+              </w:rPr>
+              <w:t>Skenario</w:t>
+            </w:r>
+          </w:p>
+        </w:tc>
+        <w:tc>
+          <w:tcPr>
+            <w:tcW w:type="dxa" w:w="2160"/>
+            <w:shd w:val="clear" w:color="auto" w:fill="1F3964"/>
+          </w:tcPr>
+          <w:p>
+            <w:r/>
+            <w:r>
+              <w:rPr>
+                <w:b/>
+                <w:color w:val="FFFFFF"/>
+                <w:sz w:val="18"/>
+              </w:rPr>
+              <w:t>Langkah</w:t>
+            </w:r>
+          </w:p>
+        </w:tc>
+        <w:tc>
+          <w:tcPr>
+            <w:tcW w:type="dxa" w:w="2160"/>
+            <w:shd w:val="clear" w:color="auto" w:fill="1F3964"/>
+          </w:tcPr>
+          <w:p>
+            <w:r/>
+            <w:r>
+              <w:rPr>
+                <w:b/>
+                <w:color w:val="FFFFFF"/>
+                <w:sz w:val="18"/>
+              </w:rPr>
+              <w:t>Hasil yang Diharapkan</w:t>
+            </w:r>
+          </w:p>
+        </w:tc>
+      </w:tr>
+      <w:tr>
+        <w:tc>
+          <w:tcPr>
+            <w:tcW w:type="dxa" w:w="720"/>
+          </w:tcPr>
+          <w:p>
+            <w:r/>
+            <w:r>
+              <w:rPr>
+                <w:b/>
+                <w:sz w:val="17"/>
+              </w:rPr>
+              <w:t>AS-01</w:t>
+            </w:r>
+          </w:p>
+        </w:tc>
+        <w:tc>
+          <w:tcPr>
+            <w:tcW w:type="dxa" w:w="2160"/>
+          </w:tcPr>
+          <w:p>
+            <w:r/>
+            <w:r>
+              <w:rPr>
+                <w:b w:val="0"/>
+                <w:sz w:val="17"/>
+              </w:rPr>
+              <w:t>Board garis lurus</w:t>
+            </w:r>
+          </w:p>
+        </w:tc>
+        <w:tc>
+          <w:tcPr>
+            <w:tcW w:type="dxa" w:w="3744"/>
+          </w:tcPr>
+          <w:p>
+            <w:r/>
+            <w:r>
+              <w:rPr>
+                <w:b w:val="0"/>
+                <w:sz w:val="17"/>
+              </w:rPr>
+              <w:t>Aset 10jt, salvage 0, linear, jumlah=5, periode=12. Compute Depreciation.</w:t>
+            </w:r>
+          </w:p>
+        </w:tc>
+        <w:tc>
+          <w:tcPr>
+            <w:tcW w:type="dxa" w:w="3024"/>
+          </w:tcPr>
+          <w:p>
+            <w:r/>
+            <w:r>
+              <w:rPr>
+                <w:b w:val="0"/>
+                <w:sz w:val="17"/>
+              </w:rPr>
+              <w:t>5 baris @ 2jt; akumulasi akhir = 10jt; remaining akhir = 0.</w:t>
+            </w:r>
+          </w:p>
+        </w:tc>
+      </w:tr>
+      <w:tr>
+        <w:tc>
+          <w:tcPr>
+            <w:tcW w:type="dxa" w:w="720"/>
+          </w:tcPr>
+          <w:p>
+            <w:r/>
+            <w:r>
+              <w:rPr>
+                <w:b/>
+                <w:sz w:val="17"/>
+              </w:rPr>
+              <w:t>AS-02</w:t>
+            </w:r>
+          </w:p>
+        </w:tc>
+        <w:tc>
+          <w:tcPr>
+            <w:tcW w:type="dxa" w:w="2160"/>
+          </w:tcPr>
+          <w:p>
+            <w:r/>
+            <w:r>
+              <w:rPr>
+                <w:b w:val="0"/>
+                <w:sz w:val="17"/>
+              </w:rPr>
+              <w:t>Posting penyusutan</w:t>
+            </w:r>
+          </w:p>
+        </w:tc>
+        <w:tc>
+          <w:tcPr>
+            <w:tcW w:type="dxa" w:w="3744"/>
+          </w:tcPr>
+          <w:p>
+            <w:r/>
+            <w:r>
+              <w:rPr>
+                <w:b w:val="0"/>
+                <w:sz w:val="17"/>
+              </w:rPr>
+              <w:t>Confirm; set tanggal baris ≤ hari ini; Post Due Depreciation.</w:t>
+            </w:r>
+          </w:p>
+        </w:tc>
+        <w:tc>
+          <w:tcPr>
+            <w:tcW w:type="dxa" w:w="3024"/>
+          </w:tcPr>
+          <w:p>
+            <w:r/>
+            <w:r>
+              <w:rPr>
+                <w:b w:val="0"/>
+                <w:sz w:val="17"/>
+              </w:rPr>
+              <w:t>Jurnal Dr Beban/Cr Akumulasi terbuat &amp; posted; ber-tag properti (analytic).</w:t>
+            </w:r>
+          </w:p>
+        </w:tc>
+      </w:tr>
+      <w:tr>
+        <w:tc>
+          <w:tcPr>
+            <w:tcW w:type="dxa" w:w="720"/>
+          </w:tcPr>
+          <w:p>
+            <w:r/>
+            <w:r>
+              <w:rPr>
+                <w:b/>
+                <w:sz w:val="17"/>
+              </w:rPr>
+              <w:t>AS-03</w:t>
+            </w:r>
+          </w:p>
+        </w:tc>
+        <w:tc>
+          <w:tcPr>
+            <w:tcW w:type="dxa" w:w="2160"/>
+          </w:tcPr>
+          <w:p>
+            <w:r/>
+            <w:r>
+              <w:rPr>
+                <w:b w:val="0"/>
+                <w:sz w:val="17"/>
+              </w:rPr>
+              <w:t>Saldo menurun</w:t>
+            </w:r>
+          </w:p>
+        </w:tc>
+        <w:tc>
+          <w:tcPr>
+            <w:tcW w:type="dxa" w:w="3744"/>
+          </w:tcPr>
+          <w:p>
+            <w:r/>
+            <w:r>
+              <w:rPr>
+                <w:b w:val="0"/>
+                <w:sz w:val="17"/>
+              </w:rPr>
+              <w:t>Aset declining, factor=2, jumlah=5. Compute.</w:t>
+            </w:r>
+          </w:p>
+        </w:tc>
+        <w:tc>
+          <w:tcPr>
+            <w:tcW w:type="dxa" w:w="3024"/>
+          </w:tcPr>
+          <w:p>
+            <w:r/>
+            <w:r>
+              <w:rPr>
+                <w:b w:val="0"/>
+                <w:sz w:val="17"/>
+              </w:rPr>
+              <w:t>Nominal menurun tiap periode; baris terakhir menutup ke salvage.</w:t>
+            </w:r>
+          </w:p>
+        </w:tc>
+      </w:tr>
+      <w:tr>
+        <w:tc>
+          <w:tcPr>
+            <w:tcW w:type="dxa" w:w="720"/>
+          </w:tcPr>
+          <w:p>
+            <w:r/>
+            <w:r>
+              <w:rPr>
+                <w:b/>
+                <w:sz w:val="17"/>
+              </w:rPr>
+              <w:t>AS-04</w:t>
+            </w:r>
+          </w:p>
+        </w:tc>
+        <w:tc>
+          <w:tcPr>
+            <w:tcW w:type="dxa" w:w="2160"/>
+          </w:tcPr>
+          <w:p>
+            <w:r/>
+            <w:r>
+              <w:rPr>
+                <w:b w:val="0"/>
+                <w:sz w:val="17"/>
+              </w:rPr>
+              <w:t>Revaluation naik</w:t>
+            </w:r>
+          </w:p>
+        </w:tc>
+        <w:tc>
+          <w:tcPr>
+            <w:tcW w:type="dxa" w:w="3744"/>
+          </w:tcPr>
+          <w:p>
+            <w:r/>
+            <w:r>
+              <w:rPr>
+                <w:b w:val="0"/>
+                <w:sz w:val="17"/>
+              </w:rPr>
+              <w:t>Tambah revaluation +5jt → Post Revaluations.</w:t>
+            </w:r>
+          </w:p>
+        </w:tc>
+        <w:tc>
+          <w:tcPr>
+            <w:tcW w:type="dxa" w:w="3024"/>
+          </w:tcPr>
+          <w:p>
+            <w:r/>
+            <w:r>
+              <w:rPr>
+                <w:b w:val="0"/>
+                <w:sz w:val="17"/>
+              </w:rPr>
+              <w:t>Jurnal Dr Aset/Cr Reserve 5jt; gross_value naik; sisa board dihitung ulang atas nilai buku baru.</w:t>
+            </w:r>
+          </w:p>
+        </w:tc>
+      </w:tr>
+      <w:tr>
+        <w:tc>
+          <w:tcPr>
+            <w:tcW w:type="dxa" w:w="720"/>
+          </w:tcPr>
+          <w:p>
+            <w:r/>
+            <w:r>
+              <w:rPr>
+                <w:b/>
+                <w:sz w:val="17"/>
+              </w:rPr>
+              <w:t>AS-05</w:t>
+            </w:r>
+          </w:p>
+        </w:tc>
+        <w:tc>
+          <w:tcPr>
+            <w:tcW w:type="dxa" w:w="2160"/>
+          </w:tcPr>
+          <w:p>
+            <w:r/>
+            <w:r>
+              <w:rPr>
+                <w:b w:val="0"/>
+                <w:sz w:val="17"/>
+              </w:rPr>
+              <w:t>Revaluation turun</w:t>
+            </w:r>
+          </w:p>
+        </w:tc>
+        <w:tc>
+          <w:tcPr>
+            <w:tcW w:type="dxa" w:w="3744"/>
+          </w:tcPr>
+          <w:p>
+            <w:r/>
+            <w:r>
+              <w:rPr>
+                <w:b w:val="0"/>
+                <w:sz w:val="17"/>
+              </w:rPr>
+              <w:t>Tambah revaluation −2jt → Post Revaluations.</w:t>
+            </w:r>
+          </w:p>
+        </w:tc>
+        <w:tc>
+          <w:tcPr>
+            <w:tcW w:type="dxa" w:w="3024"/>
+          </w:tcPr>
+          <w:p>
+            <w:r/>
+            <w:r>
+              <w:rPr>
+                <w:b w:val="0"/>
+                <w:sz w:val="17"/>
+              </w:rPr>
+              <w:t>Jurnal Dr Reserve/Cr Aset 2jt; gross_value turun; board ter-recompute.</w:t>
+            </w:r>
+          </w:p>
+        </w:tc>
+      </w:tr>
+      <w:tr>
+        <w:tc>
+          <w:tcPr>
+            <w:tcW w:type="dxa" w:w="720"/>
+          </w:tcPr>
+          <w:p>
+            <w:r/>
+            <w:r>
+              <w:rPr>
+                <w:b/>
+                <w:sz w:val="17"/>
+              </w:rPr>
+              <w:t>AS-06</w:t>
+            </w:r>
+          </w:p>
+        </w:tc>
+        <w:tc>
+          <w:tcPr>
+            <w:tcW w:type="dxa" w:w="2160"/>
+          </w:tcPr>
+          <w:p>
+            <w:r/>
+            <w:r>
+              <w:rPr>
+                <w:b w:val="0"/>
+                <w:sz w:val="17"/>
+              </w:rPr>
+              <w:t>Sync CORETAX L9</w:t>
+            </w:r>
+          </w:p>
+        </w:tc>
+        <w:tc>
+          <w:tcPr>
+            <w:tcW w:type="dxa" w:w="3744"/>
+          </w:tcPr>
+          <w:p>
+            <w:r/>
+            <w:r>
+              <w:rPr>
+                <w:b w:val="0"/>
+                <w:sz w:val="17"/>
+              </w:rPr>
+              <w:t>Klik Sync CORETAX L9 (modul coretax terpasang).</w:t>
+            </w:r>
+          </w:p>
+        </w:tc>
+        <w:tc>
+          <w:tcPr>
+            <w:tcW w:type="dxa" w:w="3024"/>
+          </w:tcPr>
+          <w:p>
+            <w:r/>
+            <w:r>
+              <w:rPr>
+                <w:b w:val="0"/>
+                <w:sz w:val="17"/>
+              </w:rPr>
+              <w:t>Entri coretax.asset.depreciation terbuat dengan nilai perolehan, remaining, penyusutan tahun berjalan.</w:t>
+            </w:r>
+          </w:p>
+        </w:tc>
+      </w:tr>
+    </w:tbl>
+    <w:p/>
+    <w:p>
+      <w:pPr>
+        <w:pStyle w:val="Heading1"/>
+      </w:pPr>
+      <w:r>
+        <w:rPr>
+          <w:color w:val="1F3964"/>
+          <w:sz w:val="30"/>
+        </w:rPr>
+        <w:t>14. Skenario Test End-to-End (Alur Lengkap)</w:t>
       </w:r>
     </w:p>
     <w:p>

</xml_diff>